<commit_message>
Add repository DOI and release links to submission documents
</commit_message>
<xml_diff>
--- a/outputs_large/CXR_Cover_Letter_Final_15.docx
+++ b/outputs_large/CXR_Cover_Letter_Final_15.docx
@@ -40,7 +40,31 @@
     <w:p/>
     <w:p>
       <w:r>
-        <w:t>The manuscript has not been published previously and is not under consideration elsewhere [TO BE CONFIRMED]. All authors have approved this submission [TO BE CONFIRMED]. The authors declare no competing interests. Data and code availability details are provided in the manuscript, with the repository or archive link to be added before submission: [TO BE FILLED: repository or archive link].</w:t>
+        <w:t xml:space="preserve">The manuscript has not been published previously and is not under consideration elsewhere [TO BE CONFIRMED]. All authors have approved this submission [TO BE CONFIRMED]. The authors declare no competing interests. Data and code availability details are provided in the manuscript; the fixed reviewer package is archived on Zenodo at </w:t>
+      </w:r>
+      <w:hyperlink r:id="rId9">
+        <w:r>
+          <w:rPr>
+            <w:color w:val="0563C1"/>
+            <w:u w:val="single"/>
+          </w:rPr>
+          <w:t>https://doi.org/10.5281/zenodo.20688290</w:t>
+        </w:r>
+      </w:hyperlink>
+      <w:r>
+        <w:t xml:space="preserve"> and available as a GitHub Release at </w:t>
+      </w:r>
+      <w:hyperlink r:id="rId10">
+        <w:r>
+          <w:rPr>
+            <w:color w:val="0563C1"/>
+            <w:u w:val="single"/>
+          </w:rPr>
+          <w:t>https://github.com/a1553189184-stack/SCI/releases/tag/v1.0-reviewer-package</w:t>
+        </w:r>
+      </w:hyperlink>
+      <w:r>
+        <w:t>.</w:t>
       </w:r>
     </w:p>
     <w:p/>

</xml_diff>